<commit_message>
Taggeo: restaurar los xmlns que el serializador descarta (Word los exige)
'Word found unreadable content' en el F033 rellenado: ElementTree solo
declara los namespaces USADOS, pero mc:Ignorable referencia prefijos por
nombre (w14, w15, w16se, wp14) — si su declaración desaparece de la raíz,
Word marca el documento como ilegible. restaurar_xmlns() fusiona en la raíz
serializada toda declaración del original que falte, en document.xml y en
cada header. Verificado: en las 4 plantillas, todas las partes declaran lo
que su mc:Ignorable pide, y el relleno con docxtemplater sigue en verde.

Co-Authored-By: Claude Opus 4.8 (1M context) <noreply@anthropic.com>
</commit_message>
<xml_diff>
--- a/plantillas/dgcp/SNCC_F034_Presentacion_de_Oferta-tpl.docx
+++ b/plantillas/dgcp/SNCC_F034_Presentacion_de_Oferta-tpl.docx
@@ -1,6 +1,6 @@
 
 <file path=word/document.xml><?xml version="1.0" encoding="utf-8"?>
-<w:document xmlns:a="http://schemas.openxmlformats.org/drawingml/2006/main" xmlns:a14="http://schemas.microsoft.com/office/drawing/2010/main" xmlns:mc="http://schemas.openxmlformats.org/markup-compatibility/2006" xmlns:o="urn:schemas-microsoft-com:office:office" xmlns:pic="http://schemas.openxmlformats.org/drawingml/2006/picture" xmlns:r="http://schemas.openxmlformats.org/officeDocument/2006/relationships" xmlns:v="urn:schemas-microsoft-com:vml" xmlns:w="http://schemas.openxmlformats.org/wordprocessingml/2006/main" xmlns:wp="http://schemas.openxmlformats.org/drawingml/2006/wordprocessingDrawing" xmlns:wp14="http://schemas.microsoft.com/office/word/2010/wordprocessingDrawing" xmlns:wpg="http://schemas.microsoft.com/office/word/2010/wordprocessingGroup" xmlns:wps="http://schemas.microsoft.com/office/word/2010/wordprocessingShape" mc:Ignorable="w14 w15 w16se wp14">
+<w:document xmlns:a="http://schemas.openxmlformats.org/drawingml/2006/main" xmlns:a14="http://schemas.microsoft.com/office/drawing/2010/main" xmlns:mc="http://schemas.openxmlformats.org/markup-compatibility/2006" xmlns:o="urn:schemas-microsoft-com:office:office" xmlns:pic="http://schemas.openxmlformats.org/drawingml/2006/picture" xmlns:r="http://schemas.openxmlformats.org/officeDocument/2006/relationships" xmlns:v="urn:schemas-microsoft-com:vml" xmlns:w="http://schemas.openxmlformats.org/wordprocessingml/2006/main" xmlns:wp="http://schemas.openxmlformats.org/drawingml/2006/wordprocessingDrawing" xmlns:wp14="http://schemas.microsoft.com/office/word/2010/wordprocessingDrawing" xmlns:wpg="http://schemas.microsoft.com/office/word/2010/wordprocessingGroup" xmlns:wps="http://schemas.microsoft.com/office/word/2010/wordprocessingShape" xmlns:wpc="http://schemas.microsoft.com/office/word/2010/wordprocessingCanvas" xmlns:cx="http://schemas.microsoft.com/office/drawing/2014/chartex" xmlns:cx1="http://schemas.microsoft.com/office/drawing/2015/9/8/chartex" xmlns:m="http://schemas.openxmlformats.org/officeDocument/2006/math" xmlns:w10="urn:schemas-microsoft-com:office:word" xmlns:w14="http://schemas.microsoft.com/office/word/2010/wordml" xmlns:w15="http://schemas.microsoft.com/office/word/2012/wordml" xmlns:w16se="http://schemas.microsoft.com/office/word/2015/wordml/symex" xmlns:wpi="http://schemas.microsoft.com/office/word/2010/wordprocessingInk" xmlns:wne="http://schemas.microsoft.com/office/word/2006/wordml" mc:Ignorable="w14 w15 w16se wp14">
   <w:body>
     <w:p>
       <w:r>
@@ -3282,7 +3282,7 @@
 </file>
 
 <file path=word/header1.xml><?xml version="1.0" encoding="utf-8"?>
-<w:hdr xmlns:a="http://schemas.openxmlformats.org/drawingml/2006/main" xmlns:a14="http://schemas.microsoft.com/office/drawing/2010/main" xmlns:mc="http://schemas.openxmlformats.org/markup-compatibility/2006" xmlns:o="urn:schemas-microsoft-com:office:office" xmlns:v="urn:schemas-microsoft-com:vml" xmlns:w="http://schemas.openxmlformats.org/wordprocessingml/2006/main" xmlns:wp="http://schemas.openxmlformats.org/drawingml/2006/wordprocessingDrawing" xmlns:wp14="http://schemas.microsoft.com/office/word/2010/wordprocessingDrawing" xmlns:wps="http://schemas.microsoft.com/office/word/2010/wordprocessingShape" mc:Ignorable="w14 w15 w16se wp14">
+<w:hdr xmlns:a="http://schemas.openxmlformats.org/drawingml/2006/main" xmlns:a14="http://schemas.microsoft.com/office/drawing/2010/main" xmlns:mc="http://schemas.openxmlformats.org/markup-compatibility/2006" xmlns:o="urn:schemas-microsoft-com:office:office" xmlns:v="urn:schemas-microsoft-com:vml" xmlns:w="http://schemas.openxmlformats.org/wordprocessingml/2006/main" xmlns:wp="http://schemas.openxmlformats.org/drawingml/2006/wordprocessingDrawing" xmlns:wp14="http://schemas.microsoft.com/office/word/2010/wordprocessingDrawing" xmlns:wps="http://schemas.microsoft.com/office/word/2010/wordprocessingShape" xmlns:wpc="http://schemas.microsoft.com/office/word/2010/wordprocessingCanvas" xmlns:cx="http://schemas.microsoft.com/office/drawing/2014/chartex" xmlns:cx1="http://schemas.microsoft.com/office/drawing/2015/9/8/chartex" xmlns:r="http://schemas.openxmlformats.org/officeDocument/2006/relationships" xmlns:m="http://schemas.openxmlformats.org/officeDocument/2006/math" xmlns:w10="urn:schemas-microsoft-com:office:word" xmlns:w14="http://schemas.microsoft.com/office/word/2010/wordml" xmlns:w15="http://schemas.microsoft.com/office/word/2012/wordml" xmlns:w16se="http://schemas.microsoft.com/office/word/2015/wordml/symex" xmlns:wpg="http://schemas.microsoft.com/office/word/2010/wordprocessingGroup" xmlns:wpi="http://schemas.microsoft.com/office/word/2010/wordprocessingInk" xmlns:wne="http://schemas.microsoft.com/office/word/2006/wordml" mc:Ignorable="w14 w15 w16se wp14">
   <w:p>
     <w:pPr>
       <w:pStyle w:val="Encabezado"/>

</xml_diff>